<commit_message>
docs(estudo): drift da Tarefa 8 vira regra de sudo da propria Alice + piada no fim
O drift semeado no web-02 era de um user 'deploy'. Agora e
'/etc/sudoers.d/zzz-alice' (alice ALL=(ALL) NOPASSWD:ALL) — feito na mao, fora
do AdminForge. Assim a Tarefa 8 conecta com a Tarefa 7: a Alice tinha se dado
root por fora, e o offboarding do AdminForge (apply) nao pega isso — so o audit.
Fecha o roteiro com a piada do reveal ("era por isso que a Alice foi demitida").
Guia do facilitador atualizado (pre-condicoes + criterio da T8).
</commit_message>
<xml_diff>
--- a/docs/usability-study/GUIA_FACILITADOR.docx
+++ b/docs/usability-study/GUIA_FACILITADOR.docx
@@ -509,19 +509,68 @@
         <w:rPr>
           <w:rStyle w:val="VerbatimChar"/>
         </w:rPr>
-        <w:t xml:space="preserve">/etc/sudoers.d/zzz-legacy-deploy</w:t>
-      </w:r>
-      <w:r>
-        <w:t xml:space="preserve"> </w:t>
-      </w:r>
-      <w:r>
-        <w:t xml:space="preserve">(regra de sudo</w:t>
-      </w:r>
-      <w:r>
-        <w:t xml:space="preserve"> </w:t>
-      </w:r>
-      <w:r>
-        <w:t xml:space="preserve">fora do AdminForge) — é o que o participante deve achar na Tarefa 8.</w:t>
+        <w:t xml:space="preserve">/etc/sudoers.d/zzz-alice</w:t>
+      </w:r>
+      <w:r>
+        <w:t xml:space="preserve"> </w:t>
+      </w:r>
+      <w:r>
+        <w:t xml:space="preserve">— uma regra de sudo</w:t>
+      </w:r>
+      <w:r>
+        <w:t xml:space="preserve"> </w:t>
+      </w:r>
+      <w:r>
+        <w:t xml:space="preserve">da própria Alice (</w:t>
+      </w:r>
+      <w:r>
+        <w:rPr>
+          <w:rStyle w:val="VerbatimChar"/>
+        </w:rPr>
+        <w:t xml:space="preserve">alice ALL=(ALL) NOPASSWD:ALL</w:t>
+      </w:r>
+      <w:r>
+        <w:t xml:space="preserve">), feita na mão, fora do AdminForge. É o que o</w:t>
+      </w:r>
+      <w:r>
+        <w:t xml:space="preserve"> </w:t>
+      </w:r>
+      <w:r>
+        <w:t xml:space="preserve">participante deve achar na Tarefa 8; e o</w:t>
+      </w:r>
+      <w:r>
+        <w:t xml:space="preserve"> </w:t>
+      </w:r>
+      <w:r>
+        <w:rPr>
+          <w:iCs/>
+          <w:i/>
+        </w:rPr>
+        <w:t xml:space="preserve">gancho</w:t>
+      </w:r>
+      <w:r>
+        <w:t xml:space="preserve"> </w:t>
+      </w:r>
+      <w:r>
+        <w:t xml:space="preserve">da piada no fim do roteiro (a Alice foi demitida</w:t>
+      </w:r>
+      <w:r>
+        <w:t xml:space="preserve"> </w:t>
+      </w:r>
+      <w:r>
+        <w:t xml:space="preserve">justamente por ter se dado root por fora). Sobrevive ao offboarding da T7 — não é um arquivo</w:t>
+      </w:r>
+      <w:r>
+        <w:t xml:space="preserve"> </w:t>
+      </w:r>
+      <w:r>
+        <w:rPr>
+          <w:rStyle w:val="VerbatimChar"/>
+        </w:rPr>
+        <w:t xml:space="preserve">adminforge-*</w:t>
+      </w:r>
+      <w:r>
+        <w:t xml:space="preserve">.</w:t>
       </w:r>
     </w:p>
     <w:p>
@@ -5394,16 +5443,25 @@
         <w:rPr>
           <w:rStyle w:val="VerbatimChar"/>
         </w:rPr>
-        <w:t xml:space="preserve">zzz-legacy-deploy</w:t>
-      </w:r>
-      <w:r>
-        <w:t xml:space="preserve">), citando-o</w:t>
-      </w:r>
-      <w:r>
-        <w:t xml:space="preserve"> </w:t>
-      </w:r>
-      <w:r>
-        <w:t xml:space="preserve">como</w:t>
+        <w:t xml:space="preserve">zzz-alice</w:t>
+      </w:r>
+      <w:r>
+        <w:t xml:space="preserve"> </w:t>
+      </w:r>
+      <w:r>
+        <w:t xml:space="preserve">—</w:t>
+      </w:r>
+      <w:r>
+        <w:t xml:space="preserve"> </w:t>
+      </w:r>
+      <w:r>
+        <w:rPr>
+          <w:rStyle w:val="VerbatimChar"/>
+        </w:rPr>
+        <w:t xml:space="preserve">alice ALL=(ALL)   NOPASSWD:ALL</w:t>
+      </w:r>
+      <w:r>
+        <w:t xml:space="preserve">), citando-o como</w:t>
       </w:r>
       <w:r>
         <w:t xml:space="preserve"> </w:t>
@@ -5416,7 +5474,46 @@
         <w:t xml:space="preserve">drift</w:t>
       </w:r>
       <w:r>
-        <w:t xml:space="preserve">/risco.</w:t>
+        <w:t xml:space="preserve">/risco. Ponto de ensino: a Alice foi</w:t>
+      </w:r>
+      <w:r>
+        <w:t xml:space="preserve"> </w:t>
+      </w:r>
+      <w:r>
+        <w:t xml:space="preserve">“</w:t>
+      </w:r>
+      <w:r>
+        <w:t xml:space="preserve">offboarded</w:t>
+      </w:r>
+      <w:r>
+        <w:t xml:space="preserve">”</w:t>
+      </w:r>
+      <w:r>
+        <w:t xml:space="preserve"> </w:t>
+      </w:r>
+      <w:r>
+        <w:t xml:space="preserve">na T7, mas</w:t>
+      </w:r>
+      <w:r>
+        <w:t xml:space="preserve"> </w:t>
+      </w:r>
+      <w:r>
+        <w:t xml:space="preserve">essa regra manual sobreviveu — o</w:t>
+      </w:r>
+      <w:r>
+        <w:t xml:space="preserve"> </w:t>
+      </w:r>
+      <w:r>
+        <w:rPr>
+          <w:rStyle w:val="VerbatimChar"/>
+        </w:rPr>
+        <w:t xml:space="preserve">apply</w:t>
+      </w:r>
+      <w:r>
+        <w:t xml:space="preserve"> </w:t>
+      </w:r>
+      <w:r>
+        <w:t xml:space="preserve">desfaz só o que o AdminForge instalou.</w:t>
       </w:r>
     </w:p>
     <w:p>

</xml_diff>